<commit_message>
Math T5 — Unité VI Traitement de données + scènes u5s9, u6s1-6, rebuild U5, livrable final V1
Co-authored-by: arena-agent <297053741+arena-agent@users.noreply.github.com>
</commit_message>
<xml_diff>
--- a/manuel-math-t5/Manuel_Mathematiques_T5_UNITE5.docx
+++ b/manuel-math-t5/Manuel_Mathematiques_T5_UNITE5.docx
@@ -26504,96 +26504,13 @@
     </w:p>
     <w:p>
       <w:pPr>
-        <w:spacing w:after="110" w:line="300"/>
-        <w:jc w:val="both"/>
-      </w:pPr>
-      <w:r>
-        <w:rPr>
-          <w:rFonts w:ascii="Times New Roman" w:cs="Times New Roman" w:eastAsia="Times New Roman" w:hAnsi="Times New Roman"/>
-          <w:b/>
-          <w:bCs/>
-          <w:i w:val="false"/>
-          <w:iCs w:val="false"/>
-          <w:color w:val="2E7D32"/>
-          <w:sz w:val="24"/>
-          <w:szCs w:val="24"/>
-        </w:rPr>
-        <w:t xml:space="preserve">Définition — </w:t>
-      </w:r>
-      <w:r>
-        <w:rPr>
-          <w:rFonts w:ascii="Times New Roman" w:cs="Times New Roman" w:eastAsia="Times New Roman" w:hAnsi="Times New Roman"/>
-          <w:b/>
-          <w:bCs/>
-          <w:i w:val="false"/>
-          <w:iCs w:val="false"/>
-          <w:color w:val="000000"/>
-          <w:sz w:val="24"/>
-          <w:szCs w:val="24"/>
-        </w:rPr>
-        <w:t xml:space="preserve">Le volume mesure la place qu’occupe un objet dans l’espace. L’unité est le cube unité : le cm³ est un cube de 1 cm d’arête. Le volume d’un pavé droit se trouve en comptant ses cubes : longueur × largeur × hauteur ; le cube, dont toutes les arêtes sont égales, a pour volume arête × arête × arête.</w:t>
-      </w:r>
-    </w:p>
-    <w:p>
-      <w:pPr>
-        <w:spacing w:after="110" w:line="300"/>
-        <w:jc w:val="both"/>
-      </w:pPr>
-      <w:r>
-        <w:rPr>
-          <w:rFonts w:ascii="Times New Roman" w:cs="Times New Roman" w:eastAsia="Times New Roman" w:hAnsi="Times New Roman"/>
-          <w:b/>
-          <w:bCs/>
-          <w:i w:val="false"/>
-          <w:iCs w:val="false"/>
-          <w:color w:val="1F4E79"/>
-          <w:sz w:val="24"/>
-          <w:szCs w:val="24"/>
-        </w:rPr>
-        <w:t xml:space="preserve">Autrement dit : </w:t>
-      </w:r>
-      <w:r>
-        <w:rPr>
-          <w:rFonts w:ascii="Times New Roman" w:cs="Times New Roman" w:eastAsia="Times New Roman" w:hAnsi="Times New Roman"/>
-          <w:b w:val="false"/>
-          <w:bCs w:val="false"/>
-          <w:i w:val="false"/>
-          <w:iCs w:val="false"/>
-          <w:color w:val="000000"/>
-          <w:sz w:val="24"/>
-          <w:szCs w:val="24"/>
-        </w:rPr>
-        <w:t xml:space="preserve">après le fil du périmètre et les carreaux de l’aire, voici les dés du volume : on compte combien de petits cubes remplissent la boîte.</w:t>
-      </w:r>
-    </w:p>
-    <w:p>
-      <w:pPr>
-        <w:spacing w:after="110" w:line="300"/>
-        <w:jc w:val="both"/>
-      </w:pPr>
-      <w:r>
-        <w:rPr>
-          <w:rFonts w:ascii="Times New Roman" w:cs="Times New Roman" w:eastAsia="Times New Roman" w:hAnsi="Times New Roman"/>
-          <w:b w:val="false"/>
-          <w:bCs w:val="false"/>
-          <w:i w:val="false"/>
-          <w:iCs w:val="false"/>
-          <w:color w:val="000000"/>
-          <w:sz w:val="24"/>
-          <w:szCs w:val="24"/>
-        </w:rPr>
-        <w:t xml:space="preserve">Le volume est le troisième étage de la tour des mesures : le périmètre suit une LIGNE (cm), l’aire couvre une SURFACE (cm²), le volume remplit un ESPACE (cm³) — un exposant de plus à chaque étage ! Le comptage s’organise comme le carrelage en 3D : un étage de 4 × 3 = 12 cubes, 2 étages → 24 cm³ ; d’où la formule L × l × h, trois longueurs multipliées (toutes dans la même unité !). Le cube est le pavé parfait : 3 × 3 × 3 = 27 cm³. La construction des solides (demandée par le programme) passe par les PATRONS : six carrés en croix se plient en cube ; le pavé réclame trois paires de rectangles. Et le volume tend la main aux capacités : la boîte de 10 × 10 × 10 = 1 000 cm³ contient exactement… 1 litre ! Le litre est un cube de 10 cm caché dans la bouteille.</w:t>
-      </w:r>
-    </w:p>
-    <w:p>
-      <w:pPr>
         <w:spacing w:after="120" w:before="120"/>
         <w:jc w:val="center"/>
       </w:pPr>
       <w:r>
         <w:drawing>
           <wp:inline distT="0" distB="0" distL="0" distR="0">
-            <wp:extent cx="4762500" cy="2419350"/>
+            <wp:extent cx="4095750" cy="2238375"/>
             <wp:effectExtent t="0" r="0" b="0" l="0"/>
             <wp:docPr id="17" name="" descr="" title=""/>
             <wp:cNvGraphicFramePr>
@@ -26610,6 +26527,135 @@
                   </pic:nvPicPr>
                   <pic:blipFill>
                     <a:blip r:embed="rId25" cstate="none"/>
+                    <a:srcRect/>
+                    <a:stretch>
+                      <a:fillRect/>
+                    </a:stretch>
+                  </pic:blipFill>
+                  <pic:spPr bwMode="auto">
+                    <a:xfrm>
+                      <a:off x="0" y="0"/>
+                      <a:ext cx="4095750" cy="2238375"/>
+                    </a:xfrm>
+                    <a:prstGeom prst="rect">
+                      <a:avLst/>
+                    </a:prstGeom>
+                  </pic:spPr>
+                </pic:pic>
+              </a:graphicData>
+            </a:graphic>
+          </wp:inline>
+        </w:drawing>
+      </w:r>
+    </w:p>
+    <w:p>
+      <w:pPr>
+        <w:spacing w:after="110" w:line="300"/>
+        <w:jc w:val="both"/>
+      </w:pPr>
+      <w:r>
+        <w:rPr>
+          <w:rFonts w:ascii="Times New Roman" w:cs="Times New Roman" w:eastAsia="Times New Roman" w:hAnsi="Times New Roman"/>
+          <w:b/>
+          <w:bCs/>
+          <w:i w:val="false"/>
+          <w:iCs w:val="false"/>
+          <w:color w:val="2E7D32"/>
+          <w:sz w:val="24"/>
+          <w:szCs w:val="24"/>
+        </w:rPr>
+        <w:t xml:space="preserve">Définition — </w:t>
+      </w:r>
+      <w:r>
+        <w:rPr>
+          <w:rFonts w:ascii="Times New Roman" w:cs="Times New Roman" w:eastAsia="Times New Roman" w:hAnsi="Times New Roman"/>
+          <w:b/>
+          <w:bCs/>
+          <w:i w:val="false"/>
+          <w:iCs w:val="false"/>
+          <w:color w:val="000000"/>
+          <w:sz w:val="24"/>
+          <w:szCs w:val="24"/>
+        </w:rPr>
+        <w:t xml:space="preserve">Le volume mesure la place qu’occupe un objet dans l’espace. L’unité est le cube unité : le cm³ est un cube de 1 cm d’arête. Le volume d’un pavé droit se trouve en comptant ses cubes : longueur × largeur × hauteur ; le cube, dont toutes les arêtes sont égales, a pour volume arête × arête × arête.</w:t>
+      </w:r>
+    </w:p>
+    <w:p>
+      <w:pPr>
+        <w:spacing w:after="110" w:line="300"/>
+        <w:jc w:val="both"/>
+      </w:pPr>
+      <w:r>
+        <w:rPr>
+          <w:rFonts w:ascii="Times New Roman" w:cs="Times New Roman" w:eastAsia="Times New Roman" w:hAnsi="Times New Roman"/>
+          <w:b/>
+          <w:bCs/>
+          <w:i w:val="false"/>
+          <w:iCs w:val="false"/>
+          <w:color w:val="1F4E79"/>
+          <w:sz w:val="24"/>
+          <w:szCs w:val="24"/>
+        </w:rPr>
+        <w:t xml:space="preserve">Autrement dit : </w:t>
+      </w:r>
+      <w:r>
+        <w:rPr>
+          <w:rFonts w:ascii="Times New Roman" w:cs="Times New Roman" w:eastAsia="Times New Roman" w:hAnsi="Times New Roman"/>
+          <w:b w:val="false"/>
+          <w:bCs w:val="false"/>
+          <w:i w:val="false"/>
+          <w:iCs w:val="false"/>
+          <w:color w:val="000000"/>
+          <w:sz w:val="24"/>
+          <w:szCs w:val="24"/>
+        </w:rPr>
+        <w:t xml:space="preserve">après le fil du périmètre et les carreaux de l’aire, voici les dés du volume : on compte combien de petits cubes remplissent la boîte.</w:t>
+      </w:r>
+    </w:p>
+    <w:p>
+      <w:pPr>
+        <w:spacing w:after="110" w:line="300"/>
+        <w:jc w:val="both"/>
+      </w:pPr>
+      <w:r>
+        <w:rPr>
+          <w:rFonts w:ascii="Times New Roman" w:cs="Times New Roman" w:eastAsia="Times New Roman" w:hAnsi="Times New Roman"/>
+          <w:b w:val="false"/>
+          <w:bCs w:val="false"/>
+          <w:i w:val="false"/>
+          <w:iCs w:val="false"/>
+          <w:color w:val="000000"/>
+          <w:sz w:val="24"/>
+          <w:szCs w:val="24"/>
+        </w:rPr>
+        <w:t xml:space="preserve">Le volume est le troisième étage de la tour des mesures : le périmètre suit une LIGNE (cm), l’aire couvre une SURFACE (cm²), le volume remplit un ESPACE (cm³) — un exposant de plus à chaque étage ! Le comptage s’organise comme le carrelage en 3D : un étage de 4 × 3 = 12 cubes, 2 étages → 24 cm³ ; d’où la formule L × l × h, trois longueurs multipliées (toutes dans la même unité !). Le cube est le pavé parfait : 3 × 3 × 3 = 27 cm³. La construction des solides (demandée par le programme) passe par les PATRONS : six carrés en croix se plient en cube ; le pavé réclame trois paires de rectangles. Et le volume tend la main aux capacités : la boîte de 10 × 10 × 10 = 1 000 cm³ contient exactement… 1 litre ! Le litre est un cube de 10 cm caché dans la bouteille.</w:t>
+      </w:r>
+    </w:p>
+    <w:p>
+      <w:pPr>
+        <w:spacing w:after="120" w:before="120"/>
+        <w:jc w:val="center"/>
+      </w:pPr>
+      <w:r>
+        <w:drawing>
+          <wp:inline distT="0" distB="0" distL="0" distR="0">
+            <wp:extent cx="4762500" cy="2419350"/>
+            <wp:effectExtent t="0" r="0" b="0" l="0"/>
+            <wp:docPr id="18" name="" descr="" title=""/>
+            <wp:cNvGraphicFramePr>
+              <a:graphicFrameLocks xmlns:a="http://schemas.openxmlformats.org/drawingml/2006/main" noChangeAspect="1"/>
+            </wp:cNvGraphicFramePr>
+            <a:graphic xmlns:a="http://schemas.openxmlformats.org/drawingml/2006/main">
+              <a:graphicData uri="http://schemas.openxmlformats.org/drawingml/2006/picture">
+                <pic:pic xmlns:pic="http://schemas.openxmlformats.org/drawingml/2006/picture">
+                  <pic:nvPicPr>
+                    <pic:cNvPr id="0" name="" descr=""/>
+                    <pic:cNvPicPr>
+                      <a:picLocks noChangeAspect="1" noChangeArrowheads="1"/>
+                    </pic:cNvPicPr>
+                  </pic:nvPicPr>
+                  <pic:blipFill>
+                    <a:blip r:embed="rId26" cstate="none"/>
                     <a:srcRect/>
                     <a:stretch>
                       <a:fillRect/>

</xml_diff>